<commit_message>
Session 6.2b : modèles de test des garanties (cotation, facture avec Mobile Money) et test de bout en bout robuste
- Modèle de facture à garanties : bloc Mobile Money exigé par le contenu obligatoire de la facture (CDC §11.2).
- Modèle de cotation à garanties ; le test de bout en bout publie les trois modèles et compare sur un texte aux espaces unifiés
  (les cellules étroites des tableaux passent à la ligne dans le texte extrait du PDF).
- Compte rendu de la session 6.2b (chiffres à compléter après la revue).

Co-Authored-By: Claude Sonnet 5.5 <noreply@anthropic.com>
Claude-Session: https://claude.ai/code/session_01EW7nE837pEKgzt6htBQA4q
</commit_message>
<xml_diff>
--- a/generateur/tests/fixtures/facture_garanties_test.docx
+++ b/generateur/tests/fixtures/facture_garanties_test.docx
@@ -298,6 +298,21 @@
     <w:p>
       <w:r>
         <w:t>Virement : {{ r.banque }}, compte {{ r.numero }}</w:t>
+      </w:r>
+    </w:p>
+    <w:p>
+      <w:r>
+        <w:t>{%p endfor %}</w:t>
+      </w:r>
+    </w:p>
+    <w:p>
+      <w:r>
+        <w:t>{%p for m in societe.mobile_money %}</w:t>
+      </w:r>
+    </w:p>
+    <w:p>
+      <w:r>
+        <w:t>Mobile Money : {{ m.operateur }}, numéro marchand {{ m.numero_marchand }}</w:t>
       </w:r>
     </w:p>
     <w:p>

</xml_diff>